<commit_message>
Updated Readme and Artifacts
</commit_message>
<xml_diff>
--- a/Documentation.docx
+++ b/Documentation.docx
@@ -166,15 +166,40 @@
     <w:p>
       <w:pPr>
         <w:rPr>
-          <w:sz w:val="24"/>
-          <w:szCs w:val="24"/>
-        </w:rPr>
-      </w:pPr>
-      <w:r>
-        <w:rPr>
-          <w:sz w:val="24"/>
-          <w:szCs w:val="24"/>
-        </w:rPr>
+          <w:sz w:val="28"/>
+          <w:szCs w:val="28"/>
+        </w:rPr>
+      </w:pPr>
+    </w:p>
+    <w:p>
+      <w:pPr>
+        <w:rPr>
+          <w:sz w:val="24"/>
+          <w:szCs w:val="24"/>
+        </w:rPr>
+      </w:pPr>
+    </w:p>
+    <w:p>
+      <w:pPr>
+        <w:rPr>
+          <w:sz w:val="24"/>
+          <w:szCs w:val="24"/>
+        </w:rPr>
+      </w:pPr>
+    </w:p>
+    <w:p>
+      <w:pPr>
+        <w:rPr>
+          <w:sz w:val="24"/>
+          <w:szCs w:val="24"/>
+        </w:rPr>
+      </w:pPr>
+      <w:r>
+        <w:rPr>
+          <w:sz w:val="24"/>
+          <w:szCs w:val="24"/>
+        </w:rPr>
+        <w:lastRenderedPageBreak/>
         <w:t>Connecting GitHub to the workspace:</w:t>
       </w:r>
     </w:p>
@@ -185,29 +210,12 @@
           <w:szCs w:val="24"/>
         </w:rPr>
       </w:pPr>
-    </w:p>
-    <w:p>
-      <w:pPr>
-        <w:rPr>
-          <w:sz w:val="24"/>
-          <w:szCs w:val="24"/>
-        </w:rPr>
-      </w:pPr>
-    </w:p>
-    <w:p>
-      <w:pPr>
-        <w:rPr>
-          <w:sz w:val="24"/>
-          <w:szCs w:val="24"/>
-        </w:rPr>
-      </w:pPr>
       <w:r>
         <w:rPr>
           <w:noProof/>
           <w:sz w:val="24"/>
           <w:szCs w:val="24"/>
         </w:rPr>
-        <w:lastRenderedPageBreak/>
         <w:drawing>
           <wp:inline distT="0" distB="0" distL="0" distR="0" wp14:anchorId="24E25D75" wp14:editId="6634C015">
             <wp:extent cx="6645910" cy="3223260"/>
@@ -530,6 +538,7 @@
       </w:pPr>
       <w:r>
         <w:rPr>
+          <w:noProof/>
           <w:sz w:val="24"/>
           <w:szCs w:val="24"/>
         </w:rPr>
@@ -846,6 +855,7 @@
       </w:pPr>
       <w:r>
         <w:rPr>
+          <w:noProof/>
           <w:sz w:val="24"/>
           <w:szCs w:val="24"/>
         </w:rPr>
@@ -895,6 +905,7 @@
       </w:pPr>
       <w:r>
         <w:rPr>
+          <w:noProof/>
           <w:sz w:val="24"/>
           <w:szCs w:val="24"/>
         </w:rPr>
@@ -945,6 +956,7 @@
       </w:pPr>
       <w:r>
         <w:rPr>
+          <w:noProof/>
           <w:sz w:val="24"/>
           <w:szCs w:val="24"/>
         </w:rPr>
@@ -1002,6 +1014,7 @@
       </w:pPr>
       <w:r>
         <w:rPr>
+          <w:noProof/>
           <w:sz w:val="24"/>
           <w:szCs w:val="24"/>
         </w:rPr>
@@ -1060,6 +1073,7 @@
       </w:pPr>
       <w:r>
         <w:rPr>
+          <w:noProof/>
           <w:sz w:val="24"/>
           <w:szCs w:val="24"/>
         </w:rPr>
@@ -1109,6 +1123,7 @@
       </w:pPr>
       <w:r>
         <w:rPr>
+          <w:noProof/>
           <w:sz w:val="24"/>
           <w:szCs w:val="24"/>
         </w:rPr>
@@ -1182,6 +1197,7 @@
       </w:pPr>
       <w:r>
         <w:rPr>
+          <w:noProof/>
           <w:sz w:val="24"/>
           <w:szCs w:val="24"/>
         </w:rPr>
@@ -1255,6 +1271,7 @@
       </w:pPr>
       <w:r>
         <w:rPr>
+          <w:noProof/>
           <w:sz w:val="24"/>
           <w:szCs w:val="24"/>
         </w:rPr>
@@ -1305,6 +1322,7 @@
       </w:pPr>
       <w:r>
         <w:rPr>
+          <w:noProof/>
           <w:sz w:val="24"/>
           <w:szCs w:val="24"/>
         </w:rPr>
@@ -1352,8 +1370,17 @@
           <w:szCs w:val="24"/>
         </w:rPr>
       </w:pPr>
-      <w:r>
-        <w:rPr>
+    </w:p>
+    <w:p>
+      <w:pPr>
+        <w:rPr>
+          <w:sz w:val="24"/>
+          <w:szCs w:val="24"/>
+        </w:rPr>
+      </w:pPr>
+      <w:r>
+        <w:rPr>
+          <w:noProof/>
           <w:sz w:val="24"/>
           <w:szCs w:val="24"/>
         </w:rPr>
@@ -1412,6 +1439,7 @@
       </w:pPr>
       <w:r>
         <w:rPr>
+          <w:noProof/>
           <w:sz w:val="24"/>
           <w:szCs w:val="24"/>
         </w:rPr>
@@ -1470,6 +1498,7 @@
       </w:pPr>
       <w:r>
         <w:rPr>
+          <w:noProof/>
           <w:sz w:val="24"/>
           <w:szCs w:val="24"/>
         </w:rPr>
@@ -1527,6 +1556,7 @@
       </w:pPr>
       <w:r>
         <w:rPr>
+          <w:noProof/>
           <w:sz w:val="24"/>
           <w:szCs w:val="24"/>
         </w:rPr>
@@ -1592,6 +1622,7 @@
       </w:pPr>
       <w:r>
         <w:rPr>
+          <w:noProof/>
           <w:sz w:val="24"/>
           <w:szCs w:val="24"/>
         </w:rPr>
@@ -1641,6 +1672,7 @@
       </w:pPr>
       <w:r>
         <w:rPr>
+          <w:noProof/>
           <w:sz w:val="24"/>
           <w:szCs w:val="24"/>
         </w:rPr>
@@ -1699,6 +1731,7 @@
       </w:pPr>
       <w:r>
         <w:rPr>
+          <w:noProof/>
           <w:sz w:val="24"/>
           <w:szCs w:val="24"/>
         </w:rPr>
@@ -1819,6 +1852,7 @@
       </w:pPr>
       <w:r>
         <w:rPr>
+          <w:noProof/>
           <w:sz w:val="24"/>
           <w:szCs w:val="24"/>
         </w:rPr>
@@ -1876,6 +1910,7 @@
       </w:pPr>
       <w:r>
         <w:rPr>
+          <w:noProof/>
           <w:sz w:val="24"/>
           <w:szCs w:val="24"/>
         </w:rPr>
@@ -1973,6 +2008,7 @@
       </w:pPr>
       <w:r>
         <w:rPr>
+          <w:noProof/>
           <w:sz w:val="24"/>
           <w:szCs w:val="24"/>
         </w:rPr>
@@ -2002,6 +2038,113 @@
                     <a:xfrm>
                       <a:off x="0" y="0"/>
                       <a:ext cx="6645910" cy="3197860"/>
+                    </a:xfrm>
+                    <a:prstGeom prst="rect">
+                      <a:avLst/>
+                    </a:prstGeom>
+                  </pic:spPr>
+                </pic:pic>
+              </a:graphicData>
+            </a:graphic>
+          </wp:inline>
+        </w:drawing>
+      </w:r>
+    </w:p>
+    <w:p>
+      <w:pPr>
+        <w:rPr>
+          <w:sz w:val="24"/>
+          <w:szCs w:val="24"/>
+        </w:rPr>
+      </w:pPr>
+      <w:r>
+        <w:rPr>
+          <w:sz w:val="28"/>
+          <w:szCs w:val="28"/>
+        </w:rPr>
+        <w:drawing>
+          <wp:inline distT="0" distB="0" distL="0" distR="0" wp14:anchorId="6DB50BF6" wp14:editId="58BB5325">
+            <wp:extent cx="6645910" cy="3246120"/>
+            <wp:effectExtent l="0" t="0" r="2540" b="0"/>
+            <wp:docPr id="2118639208" name="Picture 1"/>
+            <wp:cNvGraphicFramePr>
+              <a:graphicFrameLocks xmlns:a="http://schemas.openxmlformats.org/drawingml/2006/main" noChangeAspect="1"/>
+            </wp:cNvGraphicFramePr>
+            <a:graphic xmlns:a="http://schemas.openxmlformats.org/drawingml/2006/main">
+              <a:graphicData uri="http://schemas.openxmlformats.org/drawingml/2006/picture">
+                <pic:pic xmlns:pic="http://schemas.openxmlformats.org/drawingml/2006/picture">
+                  <pic:nvPicPr>
+                    <pic:cNvPr id="2118639208" name=""/>
+                    <pic:cNvPicPr/>
+                  </pic:nvPicPr>
+                  <pic:blipFill>
+                    <a:blip r:embed="rId32"/>
+                    <a:stretch>
+                      <a:fillRect/>
+                    </a:stretch>
+                  </pic:blipFill>
+                  <pic:spPr>
+                    <a:xfrm>
+                      <a:off x="0" y="0"/>
+                      <a:ext cx="6645910" cy="3246120"/>
+                    </a:xfrm>
+                    <a:prstGeom prst="rect">
+                      <a:avLst/>
+                    </a:prstGeom>
+                  </pic:spPr>
+                </pic:pic>
+              </a:graphicData>
+            </a:graphic>
+          </wp:inline>
+        </w:drawing>
+      </w:r>
+    </w:p>
+    <w:p>
+      <w:pPr>
+        <w:rPr>
+          <w:sz w:val="24"/>
+          <w:szCs w:val="24"/>
+        </w:rPr>
+      </w:pPr>
+    </w:p>
+    <w:p>
+      <w:pPr>
+        <w:rPr>
+          <w:sz w:val="24"/>
+          <w:szCs w:val="24"/>
+        </w:rPr>
+      </w:pPr>
+      <w:r>
+        <w:rPr>
+          <w:sz w:val="24"/>
+          <w:szCs w:val="24"/>
+        </w:rPr>
+        <w:lastRenderedPageBreak/>
+        <w:drawing>
+          <wp:inline distT="0" distB="0" distL="0" distR="0" wp14:anchorId="7C6DD5D9" wp14:editId="4D898C74">
+            <wp:extent cx="6645910" cy="3414395"/>
+            <wp:effectExtent l="0" t="0" r="2540" b="0"/>
+            <wp:docPr id="1064013241" name="Picture 1"/>
+            <wp:cNvGraphicFramePr>
+              <a:graphicFrameLocks xmlns:a="http://schemas.openxmlformats.org/drawingml/2006/main" noChangeAspect="1"/>
+            </wp:cNvGraphicFramePr>
+            <a:graphic xmlns:a="http://schemas.openxmlformats.org/drawingml/2006/main">
+              <a:graphicData uri="http://schemas.openxmlformats.org/drawingml/2006/picture">
+                <pic:pic xmlns:pic="http://schemas.openxmlformats.org/drawingml/2006/picture">
+                  <pic:nvPicPr>
+                    <pic:cNvPr id="1064013241" name=""/>
+                    <pic:cNvPicPr/>
+                  </pic:nvPicPr>
+                  <pic:blipFill>
+                    <a:blip r:embed="rId33"/>
+                    <a:stretch>
+                      <a:fillRect/>
+                    </a:stretch>
+                  </pic:blipFill>
+                  <pic:spPr>
+                    <a:xfrm>
+                      <a:off x="0" y="0"/>
+                      <a:ext cx="6645910" cy="3414395"/>
                     </a:xfrm>
                     <a:prstGeom prst="rect">
                       <a:avLst/>
@@ -2634,6 +2777,7 @@
   <w:style w:type="character" w:default="1" w:styleId="DefaultParagraphFont">
     <w:name w:val="Default Paragraph Font"/>
     <w:uiPriority w:val="1"/>
+    <w:semiHidden/>
     <w:unhideWhenUsed/>
   </w:style>
   <w:style w:type="table" w:default="1" w:styleId="TableNormal">

</xml_diff>